<commit_message>
Cleaning code + adding conclusions to simulation study and depth sensitivity analysis
</commit_message>
<xml_diff>
--- a/Report/Perch_figures/Asköfjärden_bayesian_p_prop_zero.docx
+++ b/Report/Perch_figures/Asköfjärden_bayesian_p_prop_zero.docx
@@ -352,7 +352,7 @@
                 <w:szCs w:val="22"/>
                 <w:color w:val="000000"/>
               </w:rPr>
-              <w:t xml:space="preserve">0.50</w:t>
+              <w:t xml:space="preserve">0.23</w:t>
             </w:r>
           </w:p>
         </w:tc>
@@ -464,7 +464,7 @@
                 <w:szCs w:val="22"/>
                 <w:color w:val="000000"/>
               </w:rPr>
-              <w:t xml:space="preserve">0.65</w:t>
+              <w:t xml:space="preserve">0.54</w:t>
             </w:r>
           </w:p>
         </w:tc>
@@ -576,7 +576,7 @@
                 <w:szCs w:val="22"/>
                 <w:color w:val="000000"/>
               </w:rPr>
-              <w:t xml:space="preserve">0.76</w:t>
+              <w:t xml:space="preserve">0.99</w:t>
             </w:r>
           </w:p>
         </w:tc>

</xml_diff>